<commit_message>
Doc: alteriei a atividade de requisitos de infraestrutura
</commit_message>
<xml_diff>
--- a/Requisitos de Infraestrutura.docx
+++ b/Requisitos de Infraestrutura.docx
@@ -923,7 +923,17 @@
           <w:szCs w:val="24"/>
           <w:lang w:eastAsia="pt-BR"/>
         </w:rPr>
-        <w:t xml:space="preserve"> phpMyAdin</w:t>
+        <w:t xml:space="preserve"> </w:t>
+      </w:r>
+      <w:r>
+        <w:rPr>
+          <w:rFonts w:ascii="Arial" w:hAnsi="Arial" w:cs="Arial"/>
+          <w:color w:val="1F1F1F"/>
+          <w:sz w:val="24"/>
+          <w:szCs w:val="24"/>
+          <w:shd w:val="clear" w:color="auto" w:fill="FFFFFF"/>
+        </w:rPr>
+        <w:t>MYSQL</w:t>
       </w:r>
       <w:r>
         <w:rPr>
@@ -978,7 +988,18 @@
           <w:szCs w:val="24"/>
           <w:lang w:eastAsia="pt-BR"/>
         </w:rPr>
-        <w:t xml:space="preserve"> 5.2.1, última versão estável 5.2.3</w:t>
+        <w:t xml:space="preserve"> </w:t>
+      </w:r>
+      <w:r>
+        <w:rPr>
+          <w:rFonts w:ascii="Arial" w:eastAsia="Times New Roman" w:hAnsi="Arial" w:cs="Arial"/>
+          <w:color w:val="202124"/>
+          <w:kern w:val="36"/>
+          <w:sz w:val="24"/>
+          <w:szCs w:val="24"/>
+          <w:lang w:eastAsia="pt-BR"/>
+        </w:rPr>
+        <w:t>8.3.0 – MySQL Community Server - GPL</w:t>
       </w:r>
     </w:p>
     <w:p>
@@ -1514,221 +1535,194 @@
         </w:rPr>
         <w:t xml:space="preserve"> O grupo escolheu por ser a linguagem principal por ser mais utiliza e ser mais fácil de se manusear  </w:t>
       </w:r>
+    </w:p>
+    <w:p>
+      <w:pPr>
+        <w:shd w:val="clear" w:color="auto" w:fill="FFFFFF"/>
+        <w:spacing w:after="0" w:line="240" w:lineRule="auto"/>
+        <w:jc w:val="center"/>
+        <w:outlineLvl w:val="0"/>
+        <w:rPr>
+          <w:rFonts w:ascii="Times New Roman" w:eastAsia="Times New Roman" w:hAnsi="Times New Roman" w:cs="Times New Roman"/>
+          <w:color w:val="202124"/>
+          <w:kern w:val="36"/>
+          <w:sz w:val="24"/>
+          <w:szCs w:val="24"/>
+          <w:lang w:eastAsia="pt-BR"/>
+        </w:rPr>
+      </w:pPr>
       <w:bookmarkStart w:id="0" w:name="_GoBack"/>
       <w:bookmarkEnd w:id="0"/>
     </w:p>
     <w:p>
       <w:pPr>
         <w:shd w:val="clear" w:color="auto" w:fill="FFFFFF"/>
-        <w:spacing w:after="0" w:line="360" w:lineRule="auto"/>
-        <w:ind w:firstLine="709"/>
-        <w:jc w:val="both"/>
-        <w:rPr>
-          <w:rFonts w:ascii="Times New Roman" w:eastAsia="Times New Roman" w:hAnsi="Times New Roman" w:cs="Times New Roman"/>
-          <w:color w:val="202124"/>
-          <w:kern w:val="36"/>
-          <w:sz w:val="24"/>
-          <w:szCs w:val="24"/>
-          <w:lang w:eastAsia="pt-BR"/>
-        </w:rPr>
-      </w:pPr>
-    </w:p>
-    <w:p>
-      <w:pPr>
-        <w:shd w:val="clear" w:color="auto" w:fill="FFFFFF"/>
-        <w:spacing w:after="0" w:line="240" w:lineRule="auto"/>
-        <w:jc w:val="center"/>
-        <w:outlineLvl w:val="0"/>
-        <w:rPr>
-          <w:rFonts w:ascii="Times New Roman" w:eastAsia="Times New Roman" w:hAnsi="Times New Roman" w:cs="Times New Roman"/>
-          <w:color w:val="202124"/>
-          <w:kern w:val="36"/>
-          <w:sz w:val="24"/>
-          <w:szCs w:val="24"/>
-          <w:lang w:eastAsia="pt-BR"/>
-        </w:rPr>
-      </w:pPr>
-    </w:p>
-    <w:p>
-      <w:pPr>
-        <w:shd w:val="clear" w:color="auto" w:fill="FFFFFF"/>
-        <w:spacing w:after="0" w:line="240" w:lineRule="auto"/>
-        <w:jc w:val="center"/>
-        <w:outlineLvl w:val="0"/>
-        <w:rPr>
-          <w:rFonts w:ascii="Times New Roman" w:eastAsia="Times New Roman" w:hAnsi="Times New Roman" w:cs="Times New Roman"/>
-          <w:color w:val="202124"/>
-          <w:kern w:val="36"/>
-          <w:sz w:val="24"/>
-          <w:szCs w:val="24"/>
-          <w:lang w:eastAsia="pt-BR"/>
-        </w:rPr>
-      </w:pPr>
-    </w:p>
-    <w:p>
-      <w:pPr>
-        <w:shd w:val="clear" w:color="auto" w:fill="FFFFFF"/>
-        <w:spacing w:after="0" w:line="240" w:lineRule="auto"/>
-        <w:jc w:val="center"/>
-        <w:outlineLvl w:val="0"/>
-        <w:rPr>
-          <w:rFonts w:ascii="Times New Roman" w:eastAsia="Times New Roman" w:hAnsi="Times New Roman" w:cs="Times New Roman"/>
-          <w:color w:val="202124"/>
-          <w:kern w:val="36"/>
-          <w:sz w:val="24"/>
-          <w:szCs w:val="24"/>
-          <w:lang w:eastAsia="pt-BR"/>
-        </w:rPr>
-      </w:pPr>
-    </w:p>
-    <w:p>
-      <w:pPr>
-        <w:shd w:val="clear" w:color="auto" w:fill="FFFFFF"/>
-        <w:spacing w:after="0" w:line="240" w:lineRule="auto"/>
-        <w:jc w:val="center"/>
-        <w:outlineLvl w:val="0"/>
-        <w:rPr>
-          <w:rFonts w:ascii="Times New Roman" w:eastAsia="Times New Roman" w:hAnsi="Times New Roman" w:cs="Times New Roman"/>
-          <w:color w:val="202124"/>
-          <w:kern w:val="36"/>
-          <w:sz w:val="24"/>
-          <w:szCs w:val="24"/>
-          <w:lang w:eastAsia="pt-BR"/>
-        </w:rPr>
-      </w:pPr>
-    </w:p>
-    <w:p>
-      <w:pPr>
-        <w:shd w:val="clear" w:color="auto" w:fill="FFFFFF"/>
-        <w:spacing w:after="0" w:line="240" w:lineRule="auto"/>
-        <w:jc w:val="center"/>
-        <w:outlineLvl w:val="0"/>
-        <w:rPr>
-          <w:rFonts w:ascii="Times New Roman" w:eastAsia="Times New Roman" w:hAnsi="Times New Roman" w:cs="Times New Roman"/>
-          <w:color w:val="202124"/>
-          <w:kern w:val="36"/>
-          <w:sz w:val="24"/>
-          <w:szCs w:val="24"/>
-          <w:lang w:eastAsia="pt-BR"/>
-        </w:rPr>
-      </w:pPr>
-    </w:p>
-    <w:p>
-      <w:pPr>
-        <w:shd w:val="clear" w:color="auto" w:fill="FFFFFF"/>
-        <w:spacing w:after="0" w:line="240" w:lineRule="auto"/>
-        <w:jc w:val="center"/>
-        <w:outlineLvl w:val="0"/>
-        <w:rPr>
-          <w:rFonts w:ascii="Times New Roman" w:eastAsia="Times New Roman" w:hAnsi="Times New Roman" w:cs="Times New Roman"/>
-          <w:color w:val="202124"/>
-          <w:kern w:val="36"/>
-          <w:sz w:val="24"/>
-          <w:szCs w:val="24"/>
-          <w:lang w:eastAsia="pt-BR"/>
-        </w:rPr>
-      </w:pPr>
-    </w:p>
-    <w:p>
-      <w:pPr>
-        <w:shd w:val="clear" w:color="auto" w:fill="FFFFFF"/>
-        <w:spacing w:after="0" w:line="240" w:lineRule="auto"/>
-        <w:jc w:val="center"/>
-        <w:outlineLvl w:val="0"/>
-        <w:rPr>
-          <w:rFonts w:ascii="Times New Roman" w:eastAsia="Times New Roman" w:hAnsi="Times New Roman" w:cs="Times New Roman"/>
-          <w:color w:val="202124"/>
-          <w:kern w:val="36"/>
-          <w:sz w:val="24"/>
-          <w:szCs w:val="24"/>
-          <w:lang w:eastAsia="pt-BR"/>
-        </w:rPr>
-      </w:pPr>
-    </w:p>
-    <w:p>
-      <w:pPr>
-        <w:shd w:val="clear" w:color="auto" w:fill="FFFFFF"/>
-        <w:spacing w:after="0" w:line="240" w:lineRule="auto"/>
-        <w:jc w:val="center"/>
-        <w:outlineLvl w:val="0"/>
-        <w:rPr>
-          <w:rFonts w:ascii="Times New Roman" w:eastAsia="Times New Roman" w:hAnsi="Times New Roman" w:cs="Times New Roman"/>
-          <w:color w:val="202124"/>
-          <w:kern w:val="36"/>
-          <w:sz w:val="24"/>
-          <w:szCs w:val="24"/>
-          <w:lang w:eastAsia="pt-BR"/>
-        </w:rPr>
-      </w:pPr>
-    </w:p>
-    <w:p>
-      <w:pPr>
-        <w:shd w:val="clear" w:color="auto" w:fill="FFFFFF"/>
-        <w:spacing w:after="0" w:line="240" w:lineRule="auto"/>
-        <w:jc w:val="center"/>
-        <w:outlineLvl w:val="0"/>
-        <w:rPr>
-          <w:rFonts w:ascii="Times New Roman" w:eastAsia="Times New Roman" w:hAnsi="Times New Roman" w:cs="Times New Roman"/>
-          <w:color w:val="202124"/>
-          <w:kern w:val="36"/>
-          <w:sz w:val="24"/>
-          <w:szCs w:val="24"/>
-          <w:lang w:eastAsia="pt-BR"/>
-        </w:rPr>
-      </w:pPr>
-    </w:p>
-    <w:p>
-      <w:pPr>
-        <w:shd w:val="clear" w:color="auto" w:fill="FFFFFF"/>
-        <w:spacing w:after="0" w:line="240" w:lineRule="auto"/>
-        <w:jc w:val="center"/>
-        <w:outlineLvl w:val="0"/>
-        <w:rPr>
-          <w:rFonts w:ascii="Times New Roman" w:eastAsia="Times New Roman" w:hAnsi="Times New Roman" w:cs="Times New Roman"/>
-          <w:color w:val="202124"/>
-          <w:kern w:val="36"/>
-          <w:sz w:val="24"/>
-          <w:szCs w:val="24"/>
-          <w:lang w:eastAsia="pt-BR"/>
-        </w:rPr>
-      </w:pPr>
-    </w:p>
-    <w:p>
-      <w:pPr>
-        <w:shd w:val="clear" w:color="auto" w:fill="FFFFFF"/>
-        <w:spacing w:after="0" w:line="240" w:lineRule="auto"/>
-        <w:jc w:val="center"/>
-        <w:outlineLvl w:val="0"/>
-        <w:rPr>
-          <w:rFonts w:ascii="Arial" w:eastAsia="Times New Roman" w:hAnsi="Arial" w:cs="Arial"/>
-          <w:color w:val="202124"/>
-          <w:kern w:val="36"/>
-          <w:sz w:val="24"/>
-          <w:szCs w:val="24"/>
-          <w:lang w:eastAsia="pt-BR"/>
-        </w:rPr>
-      </w:pPr>
-      <w:r>
-        <w:rPr>
-          <w:rFonts w:ascii="Arial" w:eastAsia="Times New Roman" w:hAnsi="Arial" w:cs="Arial"/>
-          <w:color w:val="202124"/>
-          <w:kern w:val="36"/>
-          <w:sz w:val="24"/>
-          <w:szCs w:val="24"/>
-          <w:lang w:eastAsia="pt-BR"/>
-        </w:rPr>
-        <w:t xml:space="preserve">Fonte: </w:t>
-      </w:r>
-      <w:r>
-        <w:rPr>
-          <w:rFonts w:ascii="Arial" w:eastAsia="Times New Roman" w:hAnsi="Arial" w:cs="Arial"/>
-          <w:color w:val="202124"/>
-          <w:kern w:val="36"/>
-          <w:sz w:val="24"/>
-          <w:szCs w:val="24"/>
-          <w:lang w:eastAsia="pt-BR"/>
-        </w:rPr>
-        <w:t xml:space="preserve">Os autores </w:t>
+        <w:spacing w:after="0" w:line="240" w:lineRule="auto"/>
+        <w:jc w:val="center"/>
+        <w:outlineLvl w:val="0"/>
+        <w:rPr>
+          <w:rFonts w:ascii="Times New Roman" w:eastAsia="Times New Roman" w:hAnsi="Times New Roman" w:cs="Times New Roman"/>
+          <w:color w:val="202124"/>
+          <w:kern w:val="36"/>
+          <w:sz w:val="24"/>
+          <w:szCs w:val="24"/>
+          <w:lang w:eastAsia="pt-BR"/>
+        </w:rPr>
+      </w:pPr>
+    </w:p>
+    <w:p>
+      <w:pPr>
+        <w:shd w:val="clear" w:color="auto" w:fill="FFFFFF"/>
+        <w:spacing w:after="0" w:line="240" w:lineRule="auto"/>
+        <w:jc w:val="center"/>
+        <w:outlineLvl w:val="0"/>
+        <w:rPr>
+          <w:rFonts w:ascii="Times New Roman" w:eastAsia="Times New Roman" w:hAnsi="Times New Roman" w:cs="Times New Roman"/>
+          <w:color w:val="202124"/>
+          <w:kern w:val="36"/>
+          <w:sz w:val="24"/>
+          <w:szCs w:val="24"/>
+          <w:lang w:eastAsia="pt-BR"/>
+        </w:rPr>
+      </w:pPr>
+    </w:p>
+    <w:p>
+      <w:pPr>
+        <w:shd w:val="clear" w:color="auto" w:fill="FFFFFF"/>
+        <w:spacing w:after="0" w:line="240" w:lineRule="auto"/>
+        <w:jc w:val="center"/>
+        <w:outlineLvl w:val="0"/>
+        <w:rPr>
+          <w:rFonts w:ascii="Times New Roman" w:eastAsia="Times New Roman" w:hAnsi="Times New Roman" w:cs="Times New Roman"/>
+          <w:color w:val="202124"/>
+          <w:kern w:val="36"/>
+          <w:sz w:val="24"/>
+          <w:szCs w:val="24"/>
+          <w:lang w:eastAsia="pt-BR"/>
+        </w:rPr>
+      </w:pPr>
+    </w:p>
+    <w:p>
+      <w:pPr>
+        <w:shd w:val="clear" w:color="auto" w:fill="FFFFFF"/>
+        <w:spacing w:after="0" w:line="240" w:lineRule="auto"/>
+        <w:jc w:val="center"/>
+        <w:outlineLvl w:val="0"/>
+        <w:rPr>
+          <w:rFonts w:ascii="Times New Roman" w:eastAsia="Times New Roman" w:hAnsi="Times New Roman" w:cs="Times New Roman"/>
+          <w:color w:val="202124"/>
+          <w:kern w:val="36"/>
+          <w:sz w:val="24"/>
+          <w:szCs w:val="24"/>
+          <w:lang w:eastAsia="pt-BR"/>
+        </w:rPr>
+      </w:pPr>
+    </w:p>
+    <w:p>
+      <w:pPr>
+        <w:shd w:val="clear" w:color="auto" w:fill="FFFFFF"/>
+        <w:spacing w:after="0" w:line="240" w:lineRule="auto"/>
+        <w:jc w:val="center"/>
+        <w:outlineLvl w:val="0"/>
+        <w:rPr>
+          <w:rFonts w:ascii="Times New Roman" w:eastAsia="Times New Roman" w:hAnsi="Times New Roman" w:cs="Times New Roman"/>
+          <w:color w:val="202124"/>
+          <w:kern w:val="36"/>
+          <w:sz w:val="24"/>
+          <w:szCs w:val="24"/>
+          <w:lang w:eastAsia="pt-BR"/>
+        </w:rPr>
+      </w:pPr>
+    </w:p>
+    <w:p>
+      <w:pPr>
+        <w:shd w:val="clear" w:color="auto" w:fill="FFFFFF"/>
+        <w:spacing w:after="0" w:line="240" w:lineRule="auto"/>
+        <w:jc w:val="center"/>
+        <w:outlineLvl w:val="0"/>
+        <w:rPr>
+          <w:rFonts w:ascii="Times New Roman" w:eastAsia="Times New Roman" w:hAnsi="Times New Roman" w:cs="Times New Roman"/>
+          <w:color w:val="202124"/>
+          <w:kern w:val="36"/>
+          <w:sz w:val="24"/>
+          <w:szCs w:val="24"/>
+          <w:lang w:eastAsia="pt-BR"/>
+        </w:rPr>
+      </w:pPr>
+    </w:p>
+    <w:p>
+      <w:pPr>
+        <w:shd w:val="clear" w:color="auto" w:fill="FFFFFF"/>
+        <w:spacing w:after="0" w:line="240" w:lineRule="auto"/>
+        <w:jc w:val="center"/>
+        <w:outlineLvl w:val="0"/>
+        <w:rPr>
+          <w:rFonts w:ascii="Times New Roman" w:eastAsia="Times New Roman" w:hAnsi="Times New Roman" w:cs="Times New Roman"/>
+          <w:color w:val="202124"/>
+          <w:kern w:val="36"/>
+          <w:sz w:val="24"/>
+          <w:szCs w:val="24"/>
+          <w:lang w:eastAsia="pt-BR"/>
+        </w:rPr>
+      </w:pPr>
+    </w:p>
+    <w:p>
+      <w:pPr>
+        <w:shd w:val="clear" w:color="auto" w:fill="FFFFFF"/>
+        <w:spacing w:after="0" w:line="240" w:lineRule="auto"/>
+        <w:jc w:val="center"/>
+        <w:outlineLvl w:val="0"/>
+        <w:rPr>
+          <w:rFonts w:ascii="Times New Roman" w:eastAsia="Times New Roman" w:hAnsi="Times New Roman" w:cs="Times New Roman"/>
+          <w:color w:val="202124"/>
+          <w:kern w:val="36"/>
+          <w:sz w:val="24"/>
+          <w:szCs w:val="24"/>
+          <w:lang w:eastAsia="pt-BR"/>
+        </w:rPr>
+      </w:pPr>
+    </w:p>
+    <w:p>
+      <w:pPr>
+        <w:shd w:val="clear" w:color="auto" w:fill="FFFFFF"/>
+        <w:spacing w:after="0" w:line="240" w:lineRule="auto"/>
+        <w:jc w:val="center"/>
+        <w:outlineLvl w:val="0"/>
+        <w:rPr>
+          <w:rFonts w:ascii="Times New Roman" w:eastAsia="Times New Roman" w:hAnsi="Times New Roman" w:cs="Times New Roman"/>
+          <w:color w:val="202124"/>
+          <w:kern w:val="36"/>
+          <w:sz w:val="24"/>
+          <w:szCs w:val="24"/>
+          <w:lang w:eastAsia="pt-BR"/>
+        </w:rPr>
+      </w:pPr>
+    </w:p>
+    <w:p>
+      <w:pPr>
+        <w:shd w:val="clear" w:color="auto" w:fill="FFFFFF"/>
+        <w:spacing w:after="0" w:line="240" w:lineRule="auto"/>
+        <w:jc w:val="center"/>
+        <w:outlineLvl w:val="0"/>
+        <w:rPr>
+          <w:rFonts w:ascii="Arial" w:eastAsia="Times New Roman" w:hAnsi="Arial" w:cs="Arial"/>
+          <w:color w:val="202124"/>
+          <w:kern w:val="36"/>
+          <w:sz w:val="24"/>
+          <w:szCs w:val="24"/>
+          <w:lang w:eastAsia="pt-BR"/>
+        </w:rPr>
+      </w:pPr>
+      <w:r>
+        <w:rPr>
+          <w:rFonts w:ascii="Arial" w:eastAsia="Times New Roman" w:hAnsi="Arial" w:cs="Arial"/>
+          <w:color w:val="202124"/>
+          <w:kern w:val="36"/>
+          <w:sz w:val="24"/>
+          <w:szCs w:val="24"/>
+          <w:lang w:eastAsia="pt-BR"/>
+        </w:rPr>
+        <w:t xml:space="preserve">Fonte: Os autores </w:t>
       </w:r>
     </w:p>
     <w:p>
@@ -3296,7 +3290,7 @@
 </file>
 
 <file path=customXml/itemProps1.xml><?xml version="1.0" encoding="utf-8"?>
-<ds:datastoreItem xmlns:ds="http://schemas.openxmlformats.org/officeDocument/2006/customXml" ds:itemID="{8C38C876-0B85-49F7-A4BB-E56A0D177D94}">
+<ds:datastoreItem xmlns:ds="http://schemas.openxmlformats.org/officeDocument/2006/customXml" ds:itemID="{FD993BA1-E657-458B-A0A2-EE740A8BEE8F}">
   <ds:schemaRefs>
     <ds:schemaRef ds:uri="http://schemas.openxmlformats.org/officeDocument/2006/bibliography"/>
   </ds:schemaRefs>

</xml_diff>